<commit_message>
Adding first running draft version of the AI assistant
</commit_message>
<xml_diff>
--- a/Files/PoC_Concept_AI_Shopping_Assistant_Chatbot.docx
+++ b/Files/PoC_Concept_AI_Shopping_Assistant_Chatbot.docx
@@ -1047,21 +1047,7 @@
                 <w:sz w:val="28"/>
                 <w:szCs w:val="28"/>
               </w:rPr>
-              <w:t>~5</w:t>
-            </w:r>
-            <w:r>
-              <w:rPr>
-                <w:sz w:val="28"/>
-                <w:szCs w:val="28"/>
-              </w:rPr>
-              <w:t>–10</w:t>
-            </w:r>
-            <w:r>
-              <w:rPr>
-                <w:sz w:val="28"/>
-                <w:szCs w:val="28"/>
-              </w:rPr>
-              <w:t xml:space="preserve"> sample orders covering various statuses (delivered, delayed, in transit, returned)</w:t>
+              <w:t>~5–10 sample orders covering various statuses (delivered, delayed, in transit, returned)</w:t>
             </w:r>
           </w:p>
         </w:tc>
@@ -1216,6 +1202,13 @@
               </w:rPr>
               <w:t>.NET App</w:t>
             </w:r>
+            <w:r>
+              <w:rPr>
+                <w:sz w:val="28"/>
+                <w:szCs w:val="28"/>
+              </w:rPr>
+              <w:t>, .NET 10</w:t>
+            </w:r>
           </w:p>
         </w:tc>
         <w:tc>
@@ -1277,7 +1270,7 @@
                 <w:sz w:val="28"/>
                 <w:szCs w:val="28"/>
               </w:rPr>
-              <w:t>Claude (API)</w:t>
+              <w:t>Claude Sonnet 5 + CodeMie</w:t>
             </w:r>
           </w:p>
         </w:tc>
@@ -2097,7 +2090,6 @@
   <w:style w:type="character" w:default="1" w:styleId="DefaultParagraphFont">
     <w:name w:val="Default Paragraph Font"/>
     <w:uiPriority w:val="1"/>
-    <w:semiHidden/>
     <w:unhideWhenUsed/>
   </w:style>
   <w:style w:type="table" w:default="1" w:styleId="TableNormal">

</xml_diff>